<commit_message>
Notebook 12: waste-burning budget (burn rate, fleet clearance, ADS driver share, LLFP neutrons); add to other-paths note
Co-Authored-By: Claude Opus 5.5 <noreply@anthropic.com>
Claude-Session: https://claude.ai/code/session_01Nh8jCABRuj7uKFFiU3YHUY
</commit_message>
<xml_diff>
--- a/notes/other_paths/other_paths_note.docx
+++ b/notes/other_paths/other_paths_note.docx
@@ -1969,7 +1969,7 @@
       </w:tr>
     </w:tbl>
     <w:bookmarkEnd w:id="25"/>
-    <w:bookmarkStart w:id="26" w:name="waste"/>
+    <w:bookmarkStart w:id="27" w:name="waste"/>
     <w:p>
       <w:pPr>
         <w:pStyle w:val="Heading1"/>
@@ -2293,14 +2293,37 @@
         <w:t xml:space="preserve">, and it is the least developed.</w:t>
       </w:r>
     </w:p>
-    <w:bookmarkEnd w:id="26"/>
-    <w:bookmarkStart w:id="27" w:name="conclusions"/>
+    <w:bookmarkStart w:id="26" w:name="waste-burning-budget-notebook-12"/>
     <w:p>
       <w:pPr>
-        <w:pStyle w:val="Heading1"/>
-      </w:pPr>
-      <w:r>
-        <w:t xml:space="preserve">5. Conclusions</w:t>
+        <w:pStyle w:val="Heading2"/>
+      </w:pPr>
+      <w:r>
+        <w:t xml:space="preserve">4.1 Waste-burning budget (notebook 12)</w:t>
+      </w:r>
+    </w:p>
+    <w:p>
+      <w:pPr>
+        <w:pStyle w:val="FirstParagraph"/>
+      </w:pPr>
+      <w:r>
+        <w:t xml:space="preserve">Energy bookkeeping fixes the burn rate: fissioning</w:t>
+      </w:r>
+      <w:r>
+        <w:t xml:space="preserve"> </w:t>
+      </w:r>
+      <w:r>
+        <w:rPr>
+          <w:bCs/>
+          <w:b/>
+        </w:rPr>
+        <w:t xml:space="preserve">0.394 t of transuranics (TRU) releases 1 GWth-year</w:t>
+      </w:r>
+      <w:r>
+        <w:t xml:space="preserve"> </w:t>
+      </w:r>
+      <w:r>
+        <w:t xml:space="preserve">(200 MeV per fission). Inventory figures below are secondary and unverified.</w:t>
       </w:r>
     </w:p>
     <w:p>
@@ -2312,7 +2335,7 @@
         <w:pStyle w:val="Compact"/>
       </w:pPr>
       <w:r>
-        <w:t xml:space="preserve">No room-temperature path closes the gap within known physics. Energetic deuterons in metals fall 3–4.5 orders short of breakeven, independent of screening.</w:t>
+        <w:t xml:space="preserve">An assumed world stock of ~4,800 t TRU (~4×10⁵ t of spent fuel at ~1.2% TRU) is ~12,200 GWth-years of heat.</w:t>
       </w:r>
     </w:p>
     <w:p>
@@ -2324,6 +2347,86 @@
         <w:pStyle w:val="Compact"/>
       </w:pPr>
       <w:r>
+        <w:t xml:space="preserve">~370 GWe of light-water reactors add ~92 t TRU per year. Holding the stock level takes ~235 GWth of burners; 300 GWth clears it in ~190 years and 1,000 GWth in ~16 years.</w:t>
+      </w:r>
+    </w:p>
+    <w:p>
+      <w:pPr>
+        <w:numPr>
+          <w:ilvl w:val="0"/>
+          <w:numId w:val="1001"/>
+        </w:numPr>
+        <w:pStyle w:val="Compact"/>
+      </w:pPr>
+      <w:r>
+        <w:t xml:space="preserve">In a subcritical (accelerator-driven) burner, the neutron driver takes</w:t>
+      </w:r>
+      <w:r>
+        <w:t xml:space="preserve"> </w:t>
+      </w:r>
+      <w:r>
+        <w:rPr>
+          <w:bCs/>
+          <w:b/>
+        </w:rPr>
+        <w:t xml:space="preserve">17% of the electrical output at k = 0.95 with spallation</w:t>
+      </w:r>
+      <w:r>
+        <w:t xml:space="preserve">, falling to 7–10% at k = 0.97–0.98. Muon-catalysed fusion today (30 n/GeV) is no better (16%). With the muon-catalysis levers of the companion muon note, the share falls to 3–6%.</w:t>
+      </w:r>
+    </w:p>
+    <w:p>
+      <w:pPr>
+        <w:numPr>
+          <w:ilvl w:val="0"/>
+          <w:numId w:val="1001"/>
+        </w:numPr>
+        <w:pStyle w:val="Compact"/>
+      </w:pPr>
+      <w:r>
+        <w:t xml:space="preserve">Transmuting the ⁹⁹Tc and ¹²⁹I made per fission takes ~0.07 neutrons. A subcritical burner at k ≤ 0.97 supplies 1.3–4.7 times that as source neutrons (an upper bound, since not all reach targets); at k = 0.98 it does not.</w:t>
+      </w:r>
+    </w:p>
+    <w:p>
+      <w:pPr>
+        <w:pStyle w:val="FirstParagraph"/>
+      </w:pPr>
+      <w:r>
+        <w:t xml:space="preserve">Clearing the waste is limited by fleet size and neutrons, not by physics. A better neutron source cuts the driver penalty roughly six-fold but does not change the fleet size that energy bookkeeping sets.</w:t>
+      </w:r>
+    </w:p>
+    <w:bookmarkEnd w:id="26"/>
+    <w:bookmarkEnd w:id="27"/>
+    <w:bookmarkStart w:id="28" w:name="conclusions"/>
+    <w:p>
+      <w:pPr>
+        <w:pStyle w:val="Heading1"/>
+      </w:pPr>
+      <w:r>
+        <w:t xml:space="preserve">5. Conclusions</w:t>
+      </w:r>
+    </w:p>
+    <w:p>
+      <w:pPr>
+        <w:numPr>
+          <w:ilvl w:val="0"/>
+          <w:numId w:val="1002"/>
+        </w:numPr>
+        <w:pStyle w:val="Compact"/>
+      </w:pPr>
+      <w:r>
+        <w:t xml:space="preserve">No room-temperature path closes the gap within known physics. Energetic deuterons in metals fall 3–4.5 orders short of breakeven, independent of screening.</w:t>
+      </w:r>
+    </w:p>
+    <w:p>
+      <w:pPr>
+        <w:numPr>
+          <w:ilvl w:val="0"/>
+          <w:numId w:val="1002"/>
+        </w:numPr>
+        <w:pStyle w:val="Compact"/>
+      </w:pPr>
+      <w:r>
         <w:t xml:space="preserve">The paths with gaps of ~10× or less are</w:t>
       </w:r>
       <w:r>
@@ -2360,7 +2463,7 @@
       <w:pPr>
         <w:numPr>
           <w:ilvl w:val="0"/>
-          <w:numId w:val="1001"/>
+          <w:numId w:val="1002"/>
         </w:numPr>
         <w:pStyle w:val="Compact"/>
       </w:pPr>
@@ -2383,7 +2486,7 @@
         <w:t xml:space="preserve"> </w:t>
       </w:r>
       <w:r>
-        <w:t xml:space="preserve">Notebook 11 at https://github.com/m1110/cold-fusion-gap. Status levels of the literature inputs: hot-fusion and waste figures are from secondary sources and press releases (2025–2026) unless noted, to be checked against primary publications before citation.</w:t>
+        <w:t xml:space="preserve">Notebooks 11 and 12 at https://github.com/m1110/cold-fusion-gap. Status levels of the literature inputs: hot-fusion and waste figures are from secondary sources and press releases (2025–2026) unless noted, to be checked against primary publications before citation.</w:t>
       </w:r>
     </w:p>
     <w:p>
@@ -2404,8 +2507,8 @@
         <w:t xml:space="preserve">Analysis and drafting assisted by an AI model (Claude, Anthropic).</w:t>
       </w:r>
     </w:p>
-    <w:bookmarkEnd w:id="27"/>
-    <w:bookmarkStart w:id="28" w:name="X1b0838627ad4f062aa0e54ff514aedbeb436b63"/>
+    <w:bookmarkEnd w:id="28"/>
+    <w:bookmarkStart w:id="29" w:name="X1b0838627ad4f062aa0e54ff514aedbeb436b63"/>
     <w:p>
       <w:pPr>
         <w:pStyle w:val="Heading1"/>
@@ -2418,7 +2521,7 @@
       <w:pPr>
         <w:numPr>
           <w:ilvl w:val="0"/>
-          <w:numId w:val="1002"/>
+          <w:numId w:val="1003"/>
         </w:numPr>
         <w:pStyle w:val="Compact"/>
       </w:pPr>
@@ -2430,7 +2533,7 @@
       <w:pPr>
         <w:numPr>
           <w:ilvl w:val="0"/>
-          <w:numId w:val="1002"/>
+          <w:numId w:val="1003"/>
         </w:numPr>
         <w:pStyle w:val="Compact"/>
       </w:pPr>
@@ -2442,7 +2545,7 @@
       <w:pPr>
         <w:numPr>
           <w:ilvl w:val="0"/>
-          <w:numId w:val="1002"/>
+          <w:numId w:val="1003"/>
         </w:numPr>
         <w:pStyle w:val="Compact"/>
       </w:pPr>
@@ -2454,7 +2557,7 @@
       <w:pPr>
         <w:numPr>
           <w:ilvl w:val="0"/>
-          <w:numId w:val="1002"/>
+          <w:numId w:val="1003"/>
         </w:numPr>
         <w:pStyle w:val="Compact"/>
       </w:pPr>
@@ -2466,7 +2569,7 @@
       <w:pPr>
         <w:numPr>
           <w:ilvl w:val="0"/>
-          <w:numId w:val="1002"/>
+          <w:numId w:val="1003"/>
         </w:numPr>
         <w:pStyle w:val="Compact"/>
       </w:pPr>
@@ -2478,7 +2581,7 @@
       <w:pPr>
         <w:numPr>
           <w:ilvl w:val="0"/>
-          <w:numId w:val="1002"/>
+          <w:numId w:val="1003"/>
         </w:numPr>
         <w:pStyle w:val="Compact"/>
       </w:pPr>
@@ -2490,7 +2593,7 @@
       <w:pPr>
         <w:numPr>
           <w:ilvl w:val="0"/>
-          <w:numId w:val="1002"/>
+          <w:numId w:val="1003"/>
         </w:numPr>
         <w:pStyle w:val="Compact"/>
       </w:pPr>
@@ -2502,7 +2605,7 @@
       <w:pPr>
         <w:numPr>
           <w:ilvl w:val="0"/>
-          <w:numId w:val="1002"/>
+          <w:numId w:val="1003"/>
         </w:numPr>
         <w:pStyle w:val="Compact"/>
       </w:pPr>
@@ -2514,7 +2617,7 @@
       <w:pPr>
         <w:numPr>
           <w:ilvl w:val="0"/>
-          <w:numId w:val="1002"/>
+          <w:numId w:val="1003"/>
         </w:numPr>
         <w:pStyle w:val="Compact"/>
       </w:pPr>
@@ -2522,7 +2625,7 @@
         <w:t xml:space="preserve">MYRRHA / SCK CEN publications (EPJ-N 2019, 2020); SINAP announcements on TMSR-LF1 (2025).</w:t>
       </w:r>
     </w:p>
-    <w:bookmarkEnd w:id="28"/>
+    <w:bookmarkEnd w:id="29"/>
     <w:sectPr/>
   </w:body>
 </w:document>
@@ -2629,6 +2732,82 @@
       </w:pPr>
     </w:lvl>
   </w:abstractNum>
+  <w:abstractNum w:abstractNumId="991">
+    <w:nsid w:val="A991"/>
+    <w:multiLevelType w:val="multilevel"/>
+    <w:lvl w:ilvl="0">
+      <w:numFmt w:val="bullet"/>
+      <w:lvlText w:val="•"/>
+      <w:lvlJc w:val="left"/>
+      <w:pPr>
+        <w:ind w:left="720" w:hanging="480"/>
+      </w:pPr>
+    </w:lvl>
+    <w:lvl w:ilvl="1">
+      <w:numFmt w:val="bullet"/>
+      <w:lvlText w:val="–"/>
+      <w:lvlJc w:val="left"/>
+      <w:pPr>
+        <w:ind w:left="1440" w:hanging="480"/>
+      </w:pPr>
+    </w:lvl>
+    <w:lvl w:ilvl="2">
+      <w:numFmt w:val="bullet"/>
+      <w:lvlText w:val="•"/>
+      <w:lvlJc w:val="left"/>
+      <w:pPr>
+        <w:ind w:left="2160" w:hanging="480"/>
+      </w:pPr>
+    </w:lvl>
+    <w:lvl w:ilvl="3">
+      <w:numFmt w:val="bullet"/>
+      <w:lvlText w:val="–"/>
+      <w:lvlJc w:val="left"/>
+      <w:pPr>
+        <w:ind w:left="2880" w:hanging="480"/>
+      </w:pPr>
+    </w:lvl>
+    <w:lvl w:ilvl="4">
+      <w:numFmt w:val="bullet"/>
+      <w:lvlText w:val="•"/>
+      <w:lvlJc w:val="left"/>
+      <w:pPr>
+        <w:ind w:left="3600" w:hanging="480"/>
+      </w:pPr>
+    </w:lvl>
+    <w:lvl w:ilvl="5">
+      <w:numFmt w:val="bullet"/>
+      <w:lvlText w:val="–"/>
+      <w:lvlJc w:val="left"/>
+      <w:pPr>
+        <w:ind w:left="4320" w:hanging="480"/>
+      </w:pPr>
+    </w:lvl>
+    <w:lvl w:ilvl="6">
+      <w:numFmt w:val="bullet"/>
+      <w:lvlText w:val="•"/>
+      <w:lvlJc w:val="left"/>
+      <w:pPr>
+        <w:ind w:left="5040" w:hanging="480"/>
+      </w:pPr>
+    </w:lvl>
+    <w:lvl w:ilvl="7">
+      <w:numFmt w:val="bullet"/>
+      <w:lvlText w:val="–"/>
+      <w:lvlJc w:val="left"/>
+      <w:pPr>
+        <w:ind w:left="5760" w:hanging="480"/>
+      </w:pPr>
+    </w:lvl>
+    <w:lvl w:ilvl="8">
+      <w:numFmt w:val="bullet"/>
+      <w:lvlText w:val="•"/>
+      <w:lvlJc w:val="left"/>
+      <w:pPr>
+        <w:ind w:left="6480" w:hanging="480"/>
+      </w:pPr>
+    </w:lvl>
+  </w:abstractNum>
   <w:abstractNum w:abstractNumId="99411">
     <w:nsid w:val="A99411"/>
     <w:multiLevelType w:val="multilevel"/>
@@ -2714,86 +2893,13 @@
       </w:pPr>
     </w:lvl>
   </w:abstractNum>
-  <w:abstractNum w:abstractNumId="991">
-    <w:nsid w:val="A991"/>
-    <w:multiLevelType w:val="multilevel"/>
-    <w:lvl w:ilvl="0">
-      <w:numFmt w:val="bullet"/>
-      <w:lvlText w:val="•"/>
-      <w:lvlJc w:val="left"/>
-      <w:pPr>
-        <w:ind w:left="720" w:hanging="480"/>
-      </w:pPr>
-    </w:lvl>
-    <w:lvl w:ilvl="1">
-      <w:numFmt w:val="bullet"/>
-      <w:lvlText w:val="–"/>
-      <w:lvlJc w:val="left"/>
-      <w:pPr>
-        <w:ind w:left="1440" w:hanging="480"/>
-      </w:pPr>
-    </w:lvl>
-    <w:lvl w:ilvl="2">
-      <w:numFmt w:val="bullet"/>
-      <w:lvlText w:val="•"/>
-      <w:lvlJc w:val="left"/>
-      <w:pPr>
-        <w:ind w:left="2160" w:hanging="480"/>
-      </w:pPr>
-    </w:lvl>
-    <w:lvl w:ilvl="3">
-      <w:numFmt w:val="bullet"/>
-      <w:lvlText w:val="–"/>
-      <w:lvlJc w:val="left"/>
-      <w:pPr>
-        <w:ind w:left="2880" w:hanging="480"/>
-      </w:pPr>
-    </w:lvl>
-    <w:lvl w:ilvl="4">
-      <w:numFmt w:val="bullet"/>
-      <w:lvlText w:val="•"/>
-      <w:lvlJc w:val="left"/>
-      <w:pPr>
-        <w:ind w:left="3600" w:hanging="480"/>
-      </w:pPr>
-    </w:lvl>
-    <w:lvl w:ilvl="5">
-      <w:numFmt w:val="bullet"/>
-      <w:lvlText w:val="–"/>
-      <w:lvlJc w:val="left"/>
-      <w:pPr>
-        <w:ind w:left="4320" w:hanging="480"/>
-      </w:pPr>
-    </w:lvl>
-    <w:lvl w:ilvl="6">
-      <w:numFmt w:val="bullet"/>
-      <w:lvlText w:val="•"/>
-      <w:lvlJc w:val="left"/>
-      <w:pPr>
-        <w:ind w:left="5040" w:hanging="480"/>
-      </w:pPr>
-    </w:lvl>
-    <w:lvl w:ilvl="7">
-      <w:numFmt w:val="bullet"/>
-      <w:lvlText w:val="–"/>
-      <w:lvlJc w:val="left"/>
-      <w:pPr>
-        <w:ind w:left="5760" w:hanging="480"/>
-      </w:pPr>
-    </w:lvl>
-    <w:lvl w:ilvl="8">
-      <w:numFmt w:val="bullet"/>
-      <w:lvlText w:val="•"/>
-      <w:lvlJc w:val="left"/>
-      <w:pPr>
-        <w:ind w:left="6480" w:hanging="480"/>
-      </w:pPr>
-    </w:lvl>
-  </w:abstractNum>
   <w:num w:numId="1000">
     <w:abstractNumId w:val="990"/>
   </w:num>
   <w:num w:numId="1001">
+    <w:abstractNumId w:val="991"/>
+  </w:num>
+  <w:num w:numId="1002">
     <w:abstractNumId w:val="99411"/>
     <w:lvlOverride w:ilvl="0">
       <w:startOverride w:val="1"/>
@@ -2823,7 +2929,7 @@
       <w:startOverride w:val="1"/>
     </w:lvlOverride>
   </w:num>
-  <w:num w:numId="1002">
+  <w:num w:numId="1003">
     <w:abstractNumId w:val="991"/>
   </w:num>
 </w:numbering>

</xml_diff>